<commit_message>
Use standard page geometry for independent review-note controls
</commit_message>
<xml_diff>
--- a/tests/Lokad.OoxPdf.Tests/Cases/CompositionProbes/scaled-note-body.docx
+++ b/tests/Lokad.OoxPdf.Tests/Cases/CompositionProbes/scaled-note-body.docx
@@ -228,8 +228,8 @@
       </ns0:r>
     </ns0:p>
     <ns0:sectPr>
-      <ns0:pgSz ns0:w="12240" ns0:h="7440"/>
-      <ns0:pgMar ns0:top="720" ns0:bottom="720" ns0:left="720" ns0:right="720"/>
+      <ns0:pgSz ns0:w="12240" ns0:h="15840"/>
+      <ns0:pgMar ns0:top="720" ns0:bottom="9120" ns0:left="720" ns0:right="720"/>
       <ns0:footnotePr>
         <ns0:numRestart ns0:val="continuous"/>
       </ns0:footnotePr>

</xml_diff>